<commit_message>
Cite Zenodo v2.0 (10.5281/zenodo.23580698) in paper and poster
- Repository reference updated from v1.1-matlab to v2.0 and its DOI;
  highlighted placeholder sentence on the network code removed.
- 4.4: one sentence on why share x denominator is below the count models
  in 2028; Section 6 sentences on model architectures and yearly updates.

Co-Authored-By: Claude Opus 5.5 <noreply@anthropic.com>
Claude-Session: https://claude.ai/code/session_01PWNQ8uQ7zzoBZAkoGAnR4L
</commit_message>
<xml_diff>
--- a/paper_itema/ITEMA_2026_Agricultural_Drones_rev1.docx
+++ b/paper_itema/ITEMA_2026_Agricultural_Drones_rev1.docx
@@ -93,7 +93,7 @@
         </w:rPr>
         <w:t xml:space="preserve">  </w:t>
       </w:r>
-      <w:hyperlink w:history="1" r:id="rIdvidk1jptyiomwqryzoqkj">
+      <w:hyperlink w:history="1" r:id="rIdjbakoivpntftivnxlu0pi">
         <w:r>
           <w:rPr>
             <w:rFonts w:ascii="Times New Roman" w:cs="Times New Roman" w:eastAsia="Times New Roman" w:hAnsi="Times New Roman"/>
@@ -133,7 +133,7 @@
         </w:rPr>
         <w:t xml:space="preserve">  </w:t>
       </w:r>
-      <w:hyperlink w:history="1" r:id="rIdklcl40jehxisczwn_luqs">
+      <w:hyperlink w:history="1" r:id="rIddf3jue6vsbnbm0xe6ecqt">
         <w:r>
           <w:rPr>
             <w:rFonts w:ascii="Times New Roman" w:cs="Times New Roman" w:eastAsia="Times New Roman" w:hAnsi="Times New Roman"/>
@@ -173,7 +173,7 @@
         </w:rPr>
         <w:t xml:space="preserve">  </w:t>
       </w:r>
-      <w:hyperlink w:history="1" r:id="rIdy_rkhvmpg97lwqou-thyx">
+      <w:hyperlink w:history="1" r:id="rIdbu4jtwvy-n-qeeg_bgkpy">
         <w:r>
           <w:rPr>
             <w:rFonts w:ascii="Times New Roman" w:cs="Times New Roman" w:eastAsia="Times New Roman" w:hAnsi="Times New Roman"/>
@@ -1054,7 +1054,7 @@
         <w:rPr>
           <w:rFonts w:ascii="Times New Roman" w:cs="Times New Roman" w:eastAsia="Times New Roman" w:hAnsi="Times New Roman"/>
         </w:rPr>
-        <w:t xml:space="preserve">Long-horizon counts were obtained by multiplying the share forecasts by a projected agricultural literature. This denominator grew by 4.7 percent per year between 2015 and 2024 (from 269,400 to 407,400 articles), and the projection applies this rate from its 2025 level. The year 2025 was excluded only from this rate, because all series jump in that year (agricultural literature +26 percent, all indexed works +18 percent), which points to expanded index coverage. Starting from the 2025 level assumes that this wider coverage is permanent; in the share, the jump largely cancels. The data and the growth-model code are archived </w:t>
+        <w:t xml:space="preserve">Long-horizon counts were obtained by multiplying the share forecasts by a projected agricultural literature. This denominator grew by 4.7 percent per year between 2015 and 2024 (from 269,400 to 407,400 articles), and the projection applies this rate from its 2025 level. The year 2025 was excluded only from this rate, because all series jump in that year (agricultural literature +26 percent, all indexed works +18 percent), which points to expanded index coverage. Starting from the 2025 level assumes that this wider coverage is permanent; in the share, the jump largely cancels. The data, the growth-model code and the keyword and network code are archived in version 2.0 of the project repository </w:t>
       </w:r>
       <w:r>
         <w:rPr>
@@ -1062,19 +1062,6 @@
           <w:color w:val="ED7D31"/>
         </w:rPr>
         <w:t xml:space="preserve">(Uroš &amp; Jelić, 2026)</w:t>
-      </w:r>
-      <w:r>
-        <w:rPr>
-          <w:rFonts w:ascii="Times New Roman" w:cs="Times New Roman" w:eastAsia="Times New Roman" w:hAnsi="Times New Roman"/>
-        </w:rPr>
-        <w:t xml:space="preserve">; </w:t>
-      </w:r>
-      <w:r>
-        <w:rPr>
-          <w:rFonts w:ascii="Times New Roman" w:cs="Times New Roman" w:eastAsia="Times New Roman" w:hAnsi="Times New Roman"/>
-          <w:highlight w:val="yellow"/>
-        </w:rPr>
-        <w:t xml:space="preserve">the keyword and network code are added to the same repository as version 2.0</w:t>
       </w:r>
       <w:r>
         <w:rPr>
@@ -3614,7 +3601,7 @@
         <w:rPr>
           <w:rFonts w:ascii="Times New Roman" w:cs="Times New Roman" w:eastAsia="Times New Roman" w:hAnsi="Times New Roman"/>
         </w:rPr>
-        <w:t xml:space="preserve"> (Version v1.1-matlab) [Data set and software]. Zenodo. https://doi.org/10.5281/zenodo.22238128</w:t>
+        <w:t xml:space="preserve"> (Version v2.0) [Data set and software]. Zenodo. https://doi.org/10.5281/zenodo.23580698</w:t>
       </w:r>
     </w:p>
     <w:p>

</xml_diff>